<commit_message>
feat: lote devolve amostra reprovada a agenda (marca ensaio/protocolo) + metricas de tempo de trabalho
Lote: ao reprovar uma amostra no Verificar Conformidade, mostra o protocolo, identifica em qual ensaio CISPR15 caiu o Fail (Conduzida/Loop/Anexo B), devolve a amostra a agenda como pendente e marca o ensaio reprovado nas observacoes. Metricas: novo lib/tempos.ts registra tempo de emissao (form->PDF) e de cadastro de amostra na agenda; dashboard mostra as medias por ano.

Co-Authored-By: Claude Opus 4.8 <noreply@anthropic.com>
</commit_message>
<xml_diff>
--- a/Manual_Validacao_CISPR15_LABELO.docx
+++ b/Manual_Validacao_CISPR15_LABELO.docx
@@ -226,7 +226,7 @@
                 <w:i w:val="0"/>
                 <w:sz w:val="19"/>
               </w:rPr>
-              <w:t>00</w:t>
+              <w:t>01</w:t>
             </w:r>
           </w:p>
         </w:tc>
@@ -267,7 +267,7 @@
                 <w:i w:val="0"/>
                 <w:sz w:val="19"/>
               </w:rPr>
-              <w:t>20/05/2026</w:t>
+              <w:t>05/06/2026</w:t>
             </w:r>
           </w:p>
         </w:tc>
@@ -6304,7 +6304,1656 @@
                 <w:color w:val="FFFFFF"/>
                 <w:sz w:val="23"/>
               </w:rPr>
-              <w:t>15. Declaração de Validação e Assinaturas</w:t>
+              <w:t>15. Módulo Lab — Gestão de Equipamentos e Certificados</w:t>
+            </w:r>
+          </w:p>
+        </w:tc>
+      </w:tr>
+    </w:tbl>
+    <w:p>
+      <w:pPr>
+        <w:spacing w:before="40" w:after="40"/>
+        <w:jc w:val="both"/>
+      </w:pPr>
+      <w:r>
+        <w:rPr>
+          <w:rFonts w:ascii="Arial" w:hAnsi="Arial"/>
+          <w:b w:val="0"/>
+          <w:i w:val="0"/>
+          <w:sz w:val="22"/>
+        </w:rPr>
+        <w:t>O Módulo Lab é um conjunto de ferramentas complementares ao sistema CISPR 15 LABELO, voltado para a gestão do laboratório EMC: cadastro de equipamentos de medição, certificados de calibração com grades de correção 2D, checagens intermediárias de instrumentos e elaboração de instruções de trabalho / procedimentos de calibração. O módulo é acessado pela barra lateral esquerda do sistema e inclui as rotas /dashboard, /equipamentos, /certificados, /checagens e /procedimentos.</w:t>
+      </w:r>
+    </w:p>
+    <w:p>
+      <w:pPr>
+        <w:spacing w:before="160" w:after="60"/>
+      </w:pPr>
+      <w:r>
+        <w:rPr>
+          <w:rFonts w:ascii="Arial" w:hAnsi="Arial"/>
+          <w:b/>
+          <w:i w:val="0"/>
+          <w:sz w:val="22"/>
+        </w:rPr>
+        <w:t>15.1 Dashboard</w:t>
+      </w:r>
+    </w:p>
+    <w:p>
+      <w:pPr>
+        <w:spacing w:before="40" w:after="40"/>
+        <w:jc w:val="both"/>
+      </w:pPr>
+      <w:r>
+        <w:rPr>
+          <w:rFonts w:ascii="Arial" w:hAnsi="Arial"/>
+          <w:b w:val="0"/>
+          <w:i w:val="0"/>
+          <w:sz w:val="22"/>
+        </w:rPr>
+        <w:t>A tela de Dashboard (/dashboard) exibe uma visão consolidada do laboratório com quatro indicadores: total de equipamentos cadastrados, normas ativas, checagens pendentes (vencendo em ≤ 30 dias) e checagens vencidas. Também lista as próximas cinco checagens em ordem de prazo com seus status.</w:t>
+      </w:r>
+    </w:p>
+    <w:p>
+      <w:pPr>
+        <w:spacing w:before="40" w:after="40"/>
+        <w:jc w:val="both"/>
+      </w:pPr>
+      <w:r>
+        <w:rPr>
+          <w:rFonts w:ascii="Arial" w:hAnsi="Arial"/>
+          <w:b w:val="0"/>
+          <w:i/>
+          <w:color w:val="AA0000"/>
+          <w:sz w:val="22"/>
+        </w:rPr>
+        <w:t>[Imagem não encontrada: lab_dashboard.png]</w:t>
+      </w:r>
+    </w:p>
+    <w:p>
+      <w:r>
+        <w:br w:type="page"/>
+      </w:r>
+    </w:p>
+    <w:tbl>
+      <w:tblPr>
+        <w:tblW w:type="auto" w:w="0"/>
+        <w:jc w:val="left"/>
+        <w:tblLook w:firstColumn="1" w:firstRow="1" w:lastColumn="0" w:lastRow="0" w:noHBand="0" w:noVBand="1" w:val="04A0"/>
+      </w:tblPr>
+      <w:tblGrid>
+        <w:gridCol w:w="9922"/>
+      </w:tblGrid>
+      <w:tr>
+        <w:tc>
+          <w:tcPr>
+            <w:tcW w:type="dxa" w:w="9922"/>
+            <w:shd w:val="clear" w:color="auto" w:fill="1F3864"/>
+          </w:tcPr>
+          <w:p>
+            <w:pPr>
+              <w:spacing w:before="40" w:after="40"/>
+              <w:ind w:left="170"/>
+            </w:pPr>
+            <w:r>
+              <w:rPr>
+                <w:rFonts w:ascii="Arial" w:hAnsi="Arial"/>
+                <w:b/>
+                <w:color w:val="FFFFFF"/>
+                <w:sz w:val="23"/>
+              </w:rPr>
+              <w:t>16. Equipamentos — Cadastro e Gestão</w:t>
+            </w:r>
+          </w:p>
+        </w:tc>
+      </w:tr>
+    </w:tbl>
+    <w:p>
+      <w:pPr>
+        <w:spacing w:before="40" w:after="40"/>
+        <w:jc w:val="both"/>
+      </w:pPr>
+      <w:r>
+        <w:rPr>
+          <w:rFonts w:ascii="Arial" w:hAnsi="Arial"/>
+          <w:b w:val="0"/>
+          <w:i w:val="0"/>
+          <w:sz w:val="22"/>
+        </w:rPr>
+        <w:t>A tela de Equipamentos (/equipamentos) permite cadastrar e gerenciar todos os instrumentos do laboratório EMC. Cada equipamento possui uma TAG identificadora única e é classificado por grupo e subgrupo.</w:t>
+      </w:r>
+    </w:p>
+    <w:p>
+      <w:pPr>
+        <w:spacing w:before="160" w:after="60"/>
+      </w:pPr>
+      <w:r>
+        <w:rPr>
+          <w:rFonts w:ascii="Arial" w:hAnsi="Arial"/>
+          <w:b/>
+          <w:i w:val="0"/>
+          <w:sz w:val="22"/>
+        </w:rPr>
+        <w:t>16.1 Grupos e Subgrupos</w:t>
+      </w:r>
+    </w:p>
+    <w:p>
+      <w:pPr>
+        <w:spacing w:before="40" w:after="40"/>
+        <w:jc w:val="both"/>
+      </w:pPr>
+      <w:r>
+        <w:rPr>
+          <w:rFonts w:ascii="Arial" w:hAnsi="Arial"/>
+          <w:b w:val="0"/>
+          <w:i w:val="0"/>
+          <w:sz w:val="22"/>
+        </w:rPr>
+        <w:t>Os equipamentos são organizados nos seguintes grupos:</w:t>
+      </w:r>
+    </w:p>
+    <w:p>
+      <w:pPr>
+        <w:pStyle w:val="ListBullet"/>
+        <w:spacing w:before="20" w:after="20"/>
+      </w:pPr>
+      <w:r>
+        <w:rPr>
+          <w:rFonts w:ascii="Arial" w:hAnsi="Arial"/>
+          <w:b w:val="0"/>
+          <w:i w:val="0"/>
+          <w:sz w:val="22"/>
+        </w:rPr>
+        <w:t>Geradores de sinal — ex.: geradores de RF, fontes de ruído.</w:t>
+      </w:r>
+    </w:p>
+    <w:p>
+      <w:pPr>
+        <w:pStyle w:val="ListBullet"/>
+        <w:spacing w:before="20" w:after="20"/>
+      </w:pPr>
+      <w:r>
+        <w:rPr>
+          <w:rFonts w:ascii="Arial" w:hAnsi="Arial"/>
+          <w:b w:val="0"/>
+          <w:i w:val="0"/>
+          <w:sz w:val="22"/>
+        </w:rPr>
+        <w:t>Medidores — receptores EMI, multímetros, osciloscópios.</w:t>
+      </w:r>
+    </w:p>
+    <w:p>
+      <w:pPr>
+        <w:pStyle w:val="ListBullet"/>
+        <w:spacing w:before="20" w:after="20"/>
+      </w:pPr>
+      <w:r>
+        <w:rPr>
+          <w:rFonts w:ascii="Arial" w:hAnsi="Arial"/>
+          <w:b w:val="0"/>
+          <w:i w:val="0"/>
+          <w:sz w:val="22"/>
+        </w:rPr>
+        <w:t>Redes de Impedância (LISN) — redes de impedância de linha.</w:t>
+      </w:r>
+    </w:p>
+    <w:p>
+      <w:pPr>
+        <w:pStyle w:val="ListBullet"/>
+        <w:spacing w:before="20" w:after="20"/>
+      </w:pPr>
+      <w:r>
+        <w:rPr>
+          <w:rFonts w:ascii="Arial" w:hAnsi="Arial"/>
+          <w:b w:val="0"/>
+          <w:i w:val="0"/>
+          <w:sz w:val="22"/>
+        </w:rPr>
+        <w:t>Antenas — antenas de ensaio e calibradas.</w:t>
+      </w:r>
+    </w:p>
+    <w:p>
+      <w:pPr>
+        <w:pStyle w:val="ListBullet"/>
+        <w:spacing w:before="20" w:after="20"/>
+      </w:pPr>
+      <w:r>
+        <w:rPr>
+          <w:rFonts w:ascii="Arial" w:hAnsi="Arial"/>
+          <w:b w:val="0"/>
+          <w:i w:val="0"/>
+          <w:sz w:val="22"/>
+        </w:rPr>
+        <w:t>Atenuação — atenuadores, cabos, acopladores.</w:t>
+      </w:r>
+    </w:p>
+    <w:p>
+      <w:pPr>
+        <w:pStyle w:val="ListBullet"/>
+        <w:spacing w:before="20" w:after="20"/>
+      </w:pPr>
+      <w:r>
+        <w:rPr>
+          <w:rFonts w:ascii="Arial" w:hAnsi="Arial"/>
+          <w:b w:val="0"/>
+          <w:i w:val="0"/>
+          <w:sz w:val="22"/>
+        </w:rPr>
+        <w:t>Grandezas Ambientais — termômetros, higrômetros.</w:t>
+      </w:r>
+    </w:p>
+    <w:p>
+      <w:pPr>
+        <w:spacing w:before="160" w:after="60"/>
+      </w:pPr>
+      <w:r>
+        <w:rPr>
+          <w:rFonts w:ascii="Arial" w:hAnsi="Arial"/>
+          <w:b/>
+          <w:i w:val="0"/>
+          <w:sz w:val="22"/>
+        </w:rPr>
+        <w:t>16.2 Dados do Equipamento</w:t>
+      </w:r>
+    </w:p>
+    <w:p>
+      <w:pPr>
+        <w:spacing w:before="40" w:after="40"/>
+        <w:jc w:val="both"/>
+      </w:pPr>
+      <w:r>
+        <w:rPr>
+          <w:rFonts w:ascii="Arial" w:hAnsi="Arial"/>
+          <w:b w:val="0"/>
+          <w:i w:val="0"/>
+          <w:sz w:val="22"/>
+        </w:rPr>
+        <w:t>Cada equipamento registra:</w:t>
+      </w:r>
+    </w:p>
+    <w:p>
+      <w:pPr>
+        <w:pStyle w:val="ListBullet"/>
+        <w:spacing w:before="20" w:after="20"/>
+      </w:pPr>
+      <w:r>
+        <w:rPr>
+          <w:rFonts w:ascii="Arial" w:hAnsi="Arial"/>
+          <w:b w:val="0"/>
+          <w:i w:val="0"/>
+          <w:sz w:val="22"/>
+        </w:rPr>
+        <w:t>TAG: identificador único (ex.: GEN-001, ANT-003).</w:t>
+      </w:r>
+    </w:p>
+    <w:p>
+      <w:pPr>
+        <w:pStyle w:val="ListBullet"/>
+        <w:spacing w:before="20" w:after="20"/>
+      </w:pPr>
+      <w:r>
+        <w:rPr>
+          <w:rFonts w:ascii="Arial" w:hAnsi="Arial"/>
+          <w:b w:val="0"/>
+          <w:i w:val="0"/>
+          <w:sz w:val="22"/>
+        </w:rPr>
+        <w:t>Nome, fabricante, modelo e número de série.</w:t>
+      </w:r>
+    </w:p>
+    <w:p>
+      <w:pPr>
+        <w:pStyle w:val="ListBullet"/>
+        <w:spacing w:before="20" w:after="20"/>
+      </w:pPr>
+      <w:r>
+        <w:rPr>
+          <w:rFonts w:ascii="Arial" w:hAnsi="Arial"/>
+          <w:b w:val="0"/>
+          <w:i w:val="0"/>
+          <w:sz w:val="22"/>
+        </w:rPr>
+        <w:t>Grupo e subgrupo de classificação.</w:t>
+      </w:r>
+    </w:p>
+    <w:p>
+      <w:pPr>
+        <w:pStyle w:val="ListBullet"/>
+        <w:spacing w:before="20" w:after="20"/>
+      </w:pPr>
+      <w:r>
+        <w:rPr>
+          <w:rFonts w:ascii="Arial" w:hAnsi="Arial"/>
+          <w:b w:val="0"/>
+          <w:i w:val="0"/>
+          <w:sz w:val="22"/>
+        </w:rPr>
+        <w:t>Data de próxima calibração e status (Ativo / Calibrar / Fora de uso).</w:t>
+      </w:r>
+    </w:p>
+    <w:p>
+      <w:pPr>
+        <w:pStyle w:val="ListBullet"/>
+        <w:spacing w:before="20" w:after="20"/>
+      </w:pPr>
+      <w:r>
+        <w:rPr>
+          <w:rFonts w:ascii="Arial" w:hAnsi="Arial"/>
+          <w:b w:val="0"/>
+          <w:i w:val="0"/>
+          <w:sz w:val="22"/>
+        </w:rPr>
+        <w:t>Certificados de calibração vinculados.</w:t>
+      </w:r>
+    </w:p>
+    <w:p>
+      <w:pPr>
+        <w:spacing w:before="40" w:after="40"/>
+        <w:jc w:val="both"/>
+      </w:pPr>
+      <w:r>
+        <w:rPr>
+          <w:rFonts w:ascii="Arial" w:hAnsi="Arial"/>
+          <w:b w:val="0"/>
+          <w:i/>
+          <w:color w:val="AA0000"/>
+          <w:sz w:val="22"/>
+        </w:rPr>
+        <w:t>[Imagem não encontrada: lab_equipamentos.png]</w:t>
+      </w:r>
+    </w:p>
+    <w:p>
+      <w:r>
+        <w:br w:type="page"/>
+      </w:r>
+    </w:p>
+    <w:tbl>
+      <w:tblPr>
+        <w:tblW w:type="auto" w:w="0"/>
+        <w:jc w:val="left"/>
+        <w:tblLook w:firstColumn="1" w:firstRow="1" w:lastColumn="0" w:lastRow="0" w:noHBand="0" w:noVBand="1" w:val="04A0"/>
+      </w:tblPr>
+      <w:tblGrid>
+        <w:gridCol w:w="9922"/>
+      </w:tblGrid>
+      <w:tr>
+        <w:tc>
+          <w:tcPr>
+            <w:tcW w:type="dxa" w:w="9922"/>
+            <w:shd w:val="clear" w:color="auto" w:fill="1F3864"/>
+          </w:tcPr>
+          <w:p>
+            <w:pPr>
+              <w:spacing w:before="40" w:after="40"/>
+              <w:ind w:left="170"/>
+            </w:pPr>
+            <w:r>
+              <w:rPr>
+                <w:rFonts w:ascii="Arial" w:hAnsi="Arial"/>
+                <w:b/>
+                <w:color w:val="FFFFFF"/>
+                <w:sz w:val="23"/>
+              </w:rPr>
+              <w:t>17. Certificados de Calibração — Grade 2D</w:t>
+            </w:r>
+          </w:p>
+        </w:tc>
+      </w:tr>
+    </w:tbl>
+    <w:p>
+      <w:pPr>
+        <w:spacing w:before="40" w:after="40"/>
+        <w:jc w:val="both"/>
+      </w:pPr>
+      <w:r>
+        <w:rPr>
+          <w:rFonts w:ascii="Arial" w:hAnsi="Arial"/>
+          <w:b w:val="0"/>
+          <w:i w:val="0"/>
+          <w:sz w:val="22"/>
+        </w:rPr>
+        <w:t>A tela de Certificados (/certificados) gerencia os certificados de calibração acreditados (ABNT NBR ISO/IEC 17025) dos padrões do laboratório. Cada certificado pode conter uma grade de correção 2D usada para interpolação bilinear nas checagens intermediárias.</w:t>
+      </w:r>
+    </w:p>
+    <w:p>
+      <w:pPr>
+        <w:spacing w:before="160" w:after="60"/>
+      </w:pPr>
+      <w:r>
+        <w:rPr>
+          <w:rFonts w:ascii="Arial" w:hAnsi="Arial"/>
+          <w:b/>
+          <w:i w:val="0"/>
+          <w:sz w:val="22"/>
+        </w:rPr>
+        <w:t>17.1 Importação via PDF (OCR)</w:t>
+      </w:r>
+    </w:p>
+    <w:p>
+      <w:pPr>
+        <w:spacing w:before="40" w:after="40"/>
+        <w:jc w:val="both"/>
+      </w:pPr>
+      <w:r>
+        <w:rPr>
+          <w:rFonts w:ascii="Arial" w:hAnsi="Arial"/>
+          <w:b w:val="0"/>
+          <w:i w:val="0"/>
+          <w:sz w:val="22"/>
+        </w:rPr>
+        <w:t>O sistema aceita certificados em PDF (ex.: LABELO/PUCRS, modelo Agilent N5171B). O arquivo é processado com pdf-parse com agrupamento espacial de pixels, extraindo as tabelas de calibração com separação de colunas por tabulação. A página de capa é ignorada automaticamente; todas as demais páginas são processadas, incluindo tabelas de distorção harmônica e de varredura de frequência.</w:t>
+      </w:r>
+    </w:p>
+    <w:p>
+      <w:pPr>
+        <w:spacing w:before="40" w:after="40"/>
+        <w:jc w:val="both"/>
+      </w:pPr>
+      <w:r>
+        <w:rPr>
+          <w:rFonts w:ascii="Arial" w:hAnsi="Arial"/>
+          <w:b w:val="0"/>
+          <w:i w:val="0"/>
+          <w:sz w:val="22"/>
+        </w:rPr>
+        <w:t>O parser identifica automaticamente:</w:t>
+      </w:r>
+    </w:p>
+    <w:p>
+      <w:pPr>
+        <w:pStyle w:val="ListBullet"/>
+        <w:spacing w:before="20" w:after="20"/>
+      </w:pPr>
+      <w:r>
+        <w:rPr>
+          <w:rFonts w:ascii="Arial" w:hAnsi="Arial"/>
+          <w:b w:val="0"/>
+          <w:i w:val="0"/>
+          <w:sz w:val="22"/>
+        </w:rPr>
+        <w:t>Número do certificado e TAG do equipamento.</w:t>
+      </w:r>
+    </w:p>
+    <w:p>
+      <w:pPr>
+        <w:pStyle w:val="ListBullet"/>
+        <w:spacing w:before="20" w:after="20"/>
+      </w:pPr>
+      <w:r>
+        <w:rPr>
+          <w:rFonts w:ascii="Arial" w:hAnsi="Arial"/>
+          <w:b w:val="0"/>
+          <w:i w:val="0"/>
+          <w:sz w:val="22"/>
+        </w:rPr>
+        <w:t>Cabeçalhos de tabela com VR (valor de referência / UST) e MM (valor medido / UMP).</w:t>
+      </w:r>
+    </w:p>
+    <w:p>
+      <w:pPr>
+        <w:pStyle w:val="ListBullet"/>
+        <w:spacing w:before="20" w:after="20"/>
+      </w:pPr>
+      <w:r>
+        <w:rPr>
+          <w:rFonts w:ascii="Arial" w:hAnsi="Arial"/>
+          <w:b w:val="0"/>
+          <w:i w:val="0"/>
+          <w:sz w:val="22"/>
+        </w:rPr>
+        <w:t>Parâmetros (ex.: "Linearidade", "Distorção Harmônica") como nome da tabela.</w:t>
+      </w:r>
+    </w:p>
+    <w:p>
+      <w:pPr>
+        <w:pStyle w:val="ListBullet"/>
+        <w:spacing w:before="20" w:after="20"/>
+      </w:pPr>
+      <w:r>
+        <w:rPr>
+          <w:rFonts w:ascii="Arial" w:hAnsi="Arial"/>
+          <w:b w:val="0"/>
+          <w:i w:val="0"/>
+          <w:sz w:val="22"/>
+        </w:rPr>
+        <w:t>"Medição de ..." como grandeza (ex.: "Potência", "Frequência").</w:t>
+      </w:r>
+    </w:p>
+    <w:p>
+      <w:pPr>
+        <w:pStyle w:val="ListBullet"/>
+        <w:spacing w:before="20" w:after="20"/>
+      </w:pPr>
+      <w:r>
+        <w:rPr>
+          <w:rFonts w:ascii="Arial" w:hAnsi="Arial"/>
+          <w:b w:val="0"/>
+          <w:i w:val="0"/>
+          <w:sz w:val="22"/>
+        </w:rPr>
+        <w:t>Correção calculada automaticamente: Correção = VR − MM.</w:t>
+      </w:r>
+    </w:p>
+    <w:p>
+      <w:pPr>
+        <w:pStyle w:val="ListBullet"/>
+        <w:spacing w:before="20" w:after="20"/>
+      </w:pPr>
+      <w:r>
+        <w:rPr>
+          <w:rFonts w:ascii="Arial" w:hAnsi="Arial"/>
+          <w:b w:val="0"/>
+          <w:i w:val="0"/>
+          <w:sz w:val="22"/>
+        </w:rPr>
+        <w:t>Incerteza (IM) detectada no cabeçalho ou pela heurística de coluna adjacente ao MM.</w:t>
+      </w:r>
+    </w:p>
+    <w:p>
+      <w:pPr>
+        <w:spacing w:before="40" w:after="40"/>
+        <w:jc w:val="both"/>
+      </w:pPr>
+      <w:r>
+        <w:rPr>
+          <w:rFonts w:ascii="Arial" w:hAnsi="Arial"/>
+          <w:b w:val="0"/>
+          <w:i/>
+          <w:sz w:val="22"/>
+        </w:rPr>
+        <w:t>A sub-linha de unidades ("UST(dBm) / UMP(dBm)") é ignorada pelo parser, evitando a sobrescrição do cabeçalho correto. Números no formato brasileiro ("1.000,5" = 1000,5 ; "2.450" = 2450) são reconhecidos automaticamente.</w:t>
+      </w:r>
+    </w:p>
+    <w:p>
+      <w:pPr>
+        <w:spacing w:before="160" w:after="60"/>
+      </w:pPr>
+      <w:r>
+        <w:rPr>
+          <w:rFonts w:ascii="Arial" w:hAnsi="Arial"/>
+          <w:b/>
+          <w:i w:val="0"/>
+          <w:sz w:val="22"/>
+        </w:rPr>
+        <w:t>17.2 Grade de Correção 2D</w:t>
+      </w:r>
+    </w:p>
+    <w:p>
+      <w:pPr>
+        <w:spacing w:before="40" w:after="40"/>
+        <w:jc w:val="both"/>
+      </w:pPr>
+      <w:r>
+        <w:rPr>
+          <w:rFonts w:ascii="Arial" w:hAnsi="Arial"/>
+          <w:b w:val="0"/>
+          <w:i w:val="0"/>
+          <w:sz w:val="22"/>
+        </w:rPr>
+        <w:t>A grade 2D representa uma função de correção f(Frequência, Nível) ou f(VR, Nível), com pontos agrupados por parâmetro (tabela). Para uso nas checagens, o sistema realiza interpolação bilinear sobre a grade para calcular a correção no ponto exato de frequência e nível solicitado, mesmo que não conste explicitamente no certificado. A tela exibe os pontos em tabela com colunas: Frequência (eixo 1), Nível VR (eixo 2), MM, Correção (VR−MM) e Incerteza.</w:t>
+      </w:r>
+    </w:p>
+    <w:p>
+      <w:pPr>
+        <w:spacing w:before="40" w:after="40"/>
+        <w:jc w:val="both"/>
+      </w:pPr>
+      <w:r>
+        <w:rPr>
+          <w:rFonts w:ascii="Arial" w:hAnsi="Arial"/>
+          <w:b w:val="0"/>
+          <w:i/>
+          <w:color w:val="AA0000"/>
+          <w:sz w:val="22"/>
+        </w:rPr>
+        <w:t>[Imagem não encontrada: lab_certificado_grade.png]</w:t>
+      </w:r>
+    </w:p>
+    <w:p>
+      <w:r>
+        <w:br w:type="page"/>
+      </w:r>
+    </w:p>
+    <w:tbl>
+      <w:tblPr>
+        <w:tblW w:type="auto" w:w="0"/>
+        <w:jc w:val="left"/>
+        <w:tblLook w:firstColumn="1" w:firstRow="1" w:lastColumn="0" w:lastRow="0" w:noHBand="0" w:noVBand="1" w:val="04A0"/>
+      </w:tblPr>
+      <w:tblGrid>
+        <w:gridCol w:w="9922"/>
+      </w:tblGrid>
+      <w:tr>
+        <w:tc>
+          <w:tcPr>
+            <w:tcW w:type="dxa" w:w="9922"/>
+            <w:shd w:val="clear" w:color="auto" w:fill="1F3864"/>
+          </w:tcPr>
+          <w:p>
+            <w:pPr>
+              <w:spacing w:before="40" w:after="40"/>
+              <w:ind w:left="170"/>
+            </w:pPr>
+            <w:r>
+              <w:rPr>
+                <w:rFonts w:ascii="Arial" w:hAnsi="Arial"/>
+                <w:b/>
+                <w:color w:val="FFFFFF"/>
+                <w:sz w:val="23"/>
+              </w:rPr>
+              <w:t>18. Checagens Intermediárias — Controle de Instrumentos</w:t>
+            </w:r>
+          </w:p>
+        </w:tc>
+      </w:tr>
+    </w:tbl>
+    <w:p>
+      <w:pPr>
+        <w:spacing w:before="40" w:after="40"/>
+        <w:jc w:val="both"/>
+      </w:pPr>
+      <w:r>
+        <w:rPr>
+          <w:rFonts w:ascii="Arial" w:hAnsi="Arial"/>
+          <w:b w:val="0"/>
+          <w:i w:val="0"/>
+          <w:sz w:val="22"/>
+        </w:rPr>
+        <w:t>A tela de Checagens (/checagens) controla as verificações intermediárias periódicas dos instrumentos de medição, conforme exigido pelo sistema da qualidade ABNT NBR ISO/IEC 17025:2017. As checagens são organizadas em três categorias: Vencidas, Vencendo nos próximos 30 dias e Em dia.</w:t>
+      </w:r>
+    </w:p>
+    <w:p>
+      <w:pPr>
+        <w:spacing w:before="160" w:after="60"/>
+      </w:pPr>
+      <w:r>
+        <w:rPr>
+          <w:rFonts w:ascii="Arial" w:hAnsi="Arial"/>
+          <w:b/>
+          <w:i w:val="0"/>
+          <w:sz w:val="22"/>
+        </w:rPr>
+        <w:t>18.1 Tipos de Checagem</w:t>
+      </w:r>
+    </w:p>
+    <w:p>
+      <w:pPr>
+        <w:spacing w:before="40" w:after="40"/>
+        <w:jc w:val="both"/>
+      </w:pPr>
+      <w:r>
+        <w:rPr>
+          <w:rFonts w:ascii="Arial" w:hAnsi="Arial"/>
+          <w:b w:val="0"/>
+          <w:i w:val="0"/>
+          <w:sz w:val="22"/>
+        </w:rPr>
+        <w:t>Existem dois modos de registro:</w:t>
+      </w:r>
+    </w:p>
+    <w:p>
+      <w:pPr>
+        <w:pStyle w:val="ListBullet"/>
+        <w:spacing w:before="20" w:after="20"/>
+      </w:pPr>
+      <w:r>
+        <w:rPr>
+          <w:rFonts w:ascii="Arial" w:hAnsi="Arial"/>
+          <w:b w:val="0"/>
+          <w:i w:val="0"/>
+          <w:sz w:val="22"/>
+        </w:rPr>
+        <w:t>Do certificado: seleciona um ponto já existente no certificado do padrão. O valor de referência (VR) e a incerteza são preenchidos automaticamente a partir da grade 2D.</w:t>
+      </w:r>
+    </w:p>
+    <w:p>
+      <w:pPr>
+        <w:pStyle w:val="ListBullet"/>
+        <w:spacing w:before="20" w:after="20"/>
+      </w:pPr>
+      <w:r>
+        <w:rPr>
+          <w:rFonts w:ascii="Arial" w:hAnsi="Arial"/>
+          <w:b w:val="0"/>
+          <w:i w:val="0"/>
+          <w:sz w:val="22"/>
+        </w:rPr>
+        <w:t>Manual com interpolação: o operador define um ponto não calibrado (frequência e nível). O sistema interpola bilinearmente a correção e calcula o VR automaticamente.</w:t>
+      </w:r>
+    </w:p>
+    <w:p>
+      <w:pPr>
+        <w:spacing w:before="160" w:after="60"/>
+      </w:pPr>
+      <w:r>
+        <w:rPr>
+          <w:rFonts w:ascii="Arial" w:hAnsi="Arial"/>
+          <w:b/>
+          <w:i w:val="0"/>
+          <w:sz w:val="22"/>
+        </w:rPr>
+        <w:t>18.2 Dados de uma Checagem</w:t>
+      </w:r>
+    </w:p>
+    <w:p>
+      <w:pPr>
+        <w:spacing w:before="40" w:after="40"/>
+        <w:jc w:val="both"/>
+      </w:pPr>
+      <w:r>
+        <w:rPr>
+          <w:rFonts w:ascii="Arial" w:hAnsi="Arial"/>
+          <w:b w:val="0"/>
+          <w:i w:val="0"/>
+          <w:sz w:val="22"/>
+        </w:rPr>
+        <w:t>Cada checagem registra:</w:t>
+      </w:r>
+    </w:p>
+    <w:p>
+      <w:pPr>
+        <w:pStyle w:val="ListBullet"/>
+        <w:spacing w:before="20" w:after="20"/>
+      </w:pPr>
+      <w:r>
+        <w:rPr>
+          <w:rFonts w:ascii="Arial" w:hAnsi="Arial"/>
+          <w:b w:val="0"/>
+          <w:i w:val="0"/>
+          <w:sz w:val="22"/>
+        </w:rPr>
+        <w:t>TAG do equipamento verificado e certificado do padrão utilizado.</w:t>
+      </w:r>
+    </w:p>
+    <w:p>
+      <w:pPr>
+        <w:pStyle w:val="ListBullet"/>
+        <w:spacing w:before="20" w:after="20"/>
+      </w:pPr>
+      <w:r>
+        <w:rPr>
+          <w:rFonts w:ascii="Arial" w:hAnsi="Arial"/>
+          <w:b w:val="0"/>
+          <w:i w:val="0"/>
+          <w:sz w:val="22"/>
+        </w:rPr>
+        <w:t>Data de realização e data da próxima checagem.</w:t>
+      </w:r>
+    </w:p>
+    <w:p>
+      <w:pPr>
+        <w:pStyle w:val="ListBullet"/>
+        <w:spacing w:before="20" w:after="20"/>
+      </w:pPr>
+      <w:r>
+        <w:rPr>
+          <w:rFonts w:ascii="Arial" w:hAnsi="Arial"/>
+          <w:b w:val="0"/>
+          <w:i w:val="0"/>
+          <w:sz w:val="22"/>
+        </w:rPr>
+        <w:t>Norma de referência (ex.: ABNT NBR ISO/IEC 17025).</w:t>
+      </w:r>
+    </w:p>
+    <w:p>
+      <w:pPr>
+        <w:pStyle w:val="ListBullet"/>
+        <w:spacing w:before="20" w:after="20"/>
+      </w:pPr>
+      <w:r>
+        <w:rPr>
+          <w:rFonts w:ascii="Arial" w:hAnsi="Arial"/>
+          <w:b w:val="0"/>
+          <w:i w:val="0"/>
+          <w:sz w:val="22"/>
+        </w:rPr>
+        <w:t>Valor de referência (VR), valor medido (MM) e correção aplicada.</w:t>
+      </w:r>
+    </w:p>
+    <w:p>
+      <w:pPr>
+        <w:pStyle w:val="ListBullet"/>
+        <w:spacing w:before="20" w:after="20"/>
+      </w:pPr>
+      <w:r>
+        <w:rPr>
+          <w:rFonts w:ascii="Arial" w:hAnsi="Arial"/>
+          <w:b w:val="0"/>
+          <w:i w:val="0"/>
+          <w:sz w:val="22"/>
+        </w:rPr>
+        <w:t>Status calculado automaticamente: APROVADO, ATENÇÃO ou REPROVADO.</w:t>
+      </w:r>
+    </w:p>
+    <w:p>
+      <w:pPr>
+        <w:pStyle w:val="ListBullet"/>
+        <w:spacing w:before="20" w:after="20"/>
+      </w:pPr>
+      <w:r>
+        <w:rPr>
+          <w:rFonts w:ascii="Arial" w:hAnsi="Arial"/>
+          <w:b w:val="0"/>
+          <w:i w:val="0"/>
+          <w:sz w:val="22"/>
+        </w:rPr>
+        <w:t>Observações do técnico.</w:t>
+      </w:r>
+    </w:p>
+    <w:p>
+      <w:pPr>
+        <w:spacing w:before="160" w:after="60"/>
+      </w:pPr>
+      <w:r>
+        <w:rPr>
+          <w:rFonts w:ascii="Arial" w:hAnsi="Arial"/>
+          <w:b/>
+          <w:i w:val="0"/>
+          <w:sz w:val="22"/>
+        </w:rPr>
+        <w:t>18.3 Templates de Checagem</w:t>
+      </w:r>
+    </w:p>
+    <w:p>
+      <w:pPr>
+        <w:spacing w:before="40" w:after="40"/>
+        <w:jc w:val="both"/>
+      </w:pPr>
+      <w:r>
+        <w:rPr>
+          <w:rFonts w:ascii="Arial" w:hAnsi="Arial"/>
+          <w:b w:val="0"/>
+          <w:i w:val="0"/>
+          <w:sz w:val="22"/>
+        </w:rPr>
+        <w:t>A tela de Templates (/checagens/templates) permite criar modelos reutilizáveis de checagem, pré-configurados com equipamento, parâmetros e periodicidade. Facilita o registro de checagens recorrentes com um clique.</w:t>
+      </w:r>
+    </w:p>
+    <w:p>
+      <w:pPr>
+        <w:spacing w:before="40" w:after="40"/>
+        <w:jc w:val="both"/>
+      </w:pPr>
+      <w:r>
+        <w:rPr>
+          <w:rFonts w:ascii="Arial" w:hAnsi="Arial"/>
+          <w:b w:val="0"/>
+          <w:i/>
+          <w:color w:val="AA0000"/>
+          <w:sz w:val="22"/>
+        </w:rPr>
+        <w:t>[Imagem não encontrada: lab_checagens.png]</w:t>
+      </w:r>
+    </w:p>
+    <w:p>
+      <w:r>
+        <w:br w:type="page"/>
+      </w:r>
+    </w:p>
+    <w:tbl>
+      <w:tblPr>
+        <w:tblW w:type="auto" w:w="0"/>
+        <w:jc w:val="left"/>
+        <w:tblLook w:firstColumn="1" w:firstRow="1" w:lastColumn="0" w:lastRow="0" w:noHBand="0" w:noVBand="1" w:val="04A0"/>
+      </w:tblPr>
+      <w:tblGrid>
+        <w:gridCol w:w="9922"/>
+      </w:tblGrid>
+      <w:tr>
+        <w:tc>
+          <w:tcPr>
+            <w:tcW w:type="dxa" w:w="9922"/>
+            <w:shd w:val="clear" w:color="auto" w:fill="1F3864"/>
+          </w:tcPr>
+          <w:p>
+            <w:pPr>
+              <w:spacing w:before="40" w:after="40"/>
+              <w:ind w:left="170"/>
+            </w:pPr>
+            <w:r>
+              <w:rPr>
+                <w:rFonts w:ascii="Arial" w:hAnsi="Arial"/>
+                <w:b/>
+                <w:color w:val="FFFFFF"/>
+                <w:sz w:val="23"/>
+              </w:rPr>
+              <w:t>19. Normas — Banco de Normas Técnicas</w:t>
+            </w:r>
+          </w:p>
+        </w:tc>
+      </w:tr>
+    </w:tbl>
+    <w:p>
+      <w:pPr>
+        <w:spacing w:before="40" w:after="40"/>
+        <w:jc w:val="both"/>
+      </w:pPr>
+      <w:r>
+        <w:rPr>
+          <w:rFonts w:ascii="Arial" w:hAnsi="Arial"/>
+          <w:b w:val="0"/>
+          <w:i w:val="0"/>
+          <w:sz w:val="22"/>
+        </w:rPr>
+        <w:t>A tela de Normas (/normas) gerencia o banco de normas técnicas utilizadas nos ensaios e calibrações do laboratório. Permite cadastrar normas com número, título, organismo publicador (ABNT, IEC, CISPR, etc.), edição, ano e situação (vigente, substituída, cancelada). O dashboard exibe o total de normas ativas como indicador de referência.</w:t>
+      </w:r>
+    </w:p>
+    <w:p>
+      <w:r>
+        <w:br w:type="page"/>
+      </w:r>
+    </w:p>
+    <w:tbl>
+      <w:tblPr>
+        <w:tblW w:type="auto" w:w="0"/>
+        <w:jc w:val="left"/>
+        <w:tblLook w:firstColumn="1" w:firstRow="1" w:lastColumn="0" w:lastRow="0" w:noHBand="0" w:noVBand="1" w:val="04A0"/>
+      </w:tblPr>
+      <w:tblGrid>
+        <w:gridCol w:w="9922"/>
+      </w:tblGrid>
+      <w:tr>
+        <w:tc>
+          <w:tcPr>
+            <w:tcW w:type="dxa" w:w="9922"/>
+            <w:shd w:val="clear" w:color="auto" w:fill="1F3864"/>
+          </w:tcPr>
+          <w:p>
+            <w:pPr>
+              <w:spacing w:before="40" w:after="40"/>
+              <w:ind w:left="170"/>
+            </w:pPr>
+            <w:r>
+              <w:rPr>
+                <w:rFonts w:ascii="Arial" w:hAnsi="Arial"/>
+                <w:b/>
+                <w:color w:val="FFFFFF"/>
+                <w:sz w:val="23"/>
+              </w:rPr>
+              <w:t>20. Procedimentos — Instruções de Trabalho e Procedimentos de Calibração</w:t>
+            </w:r>
+          </w:p>
+        </w:tc>
+      </w:tr>
+    </w:tbl>
+    <w:p>
+      <w:pPr>
+        <w:spacing w:before="40" w:after="40"/>
+        <w:jc w:val="both"/>
+      </w:pPr>
+      <w:r>
+        <w:rPr>
+          <w:rFonts w:ascii="Arial" w:hAnsi="Arial"/>
+          <w:b w:val="0"/>
+          <w:i w:val="0"/>
+          <w:sz w:val="22"/>
+        </w:rPr>
+        <w:t>O módulo de Procedimentos (/procedimentos) centraliza a criação e gestão de Instruções de Trabalho (IT) e Procedimentos de Calibração (PC) no formato padrão LABELO.</w:t>
+      </w:r>
+    </w:p>
+    <w:p>
+      <w:pPr>
+        <w:spacing w:before="160" w:after="60"/>
+      </w:pPr>
+      <w:r>
+        <w:rPr>
+          <w:rFonts w:ascii="Arial" w:hAnsi="Arial"/>
+          <w:b/>
+          <w:i w:val="0"/>
+          <w:sz w:val="22"/>
+        </w:rPr>
+        <w:t>20.1 Editor de IT / PC</w:t>
+      </w:r>
+    </w:p>
+    <w:p>
+      <w:pPr>
+        <w:spacing w:before="40" w:after="40"/>
+        <w:jc w:val="both"/>
+      </w:pPr>
+      <w:r>
+        <w:rPr>
+          <w:rFonts w:ascii="Arial" w:hAnsi="Arial"/>
+          <w:b w:val="0"/>
+          <w:i w:val="0"/>
+          <w:sz w:val="22"/>
+        </w:rPr>
+        <w:t>O editor de documentos (/procedimentos/instrucoes/novo) oferece um ambiente estruturado para elaboração de documentos técnicos com os seguintes elementos:</w:t>
+      </w:r>
+    </w:p>
+    <w:p>
+      <w:pPr>
+        <w:pStyle w:val="ListBullet"/>
+        <w:spacing w:before="20" w:after="20"/>
+      </w:pPr>
+      <w:r>
+        <w:rPr>
+          <w:rFonts w:ascii="Arial" w:hAnsi="Arial"/>
+          <w:b w:val="0"/>
+          <w:i w:val="0"/>
+          <w:sz w:val="22"/>
+        </w:rPr>
+        <w:t>Seções numeradas com hierarquia (1, 1.1, 1.1.1).</w:t>
+      </w:r>
+    </w:p>
+    <w:p>
+      <w:pPr>
+        <w:pStyle w:val="ListBullet"/>
+        <w:spacing w:before="20" w:after="20"/>
+      </w:pPr>
+      <w:r>
+        <w:rPr>
+          <w:rFonts w:ascii="Arial" w:hAnsi="Arial"/>
+          <w:b w:val="0"/>
+          <w:i w:val="0"/>
+          <w:sz w:val="22"/>
+        </w:rPr>
+        <w:t>Parágrafos de texto justificado.</w:t>
+      </w:r>
+    </w:p>
+    <w:p>
+      <w:pPr>
+        <w:pStyle w:val="ListBullet"/>
+        <w:spacing w:before="20" w:after="20"/>
+      </w:pPr>
+      <w:r>
+        <w:rPr>
+          <w:rFonts w:ascii="Arial" w:hAnsi="Arial"/>
+          <w:b w:val="0"/>
+          <w:i w:val="0"/>
+          <w:sz w:val="22"/>
+        </w:rPr>
+        <w:t>Listas com marcadores e listas de passos numerados.</w:t>
+      </w:r>
+    </w:p>
+    <w:p>
+      <w:pPr>
+        <w:pStyle w:val="ListBullet"/>
+        <w:spacing w:before="20" w:after="20"/>
+      </w:pPr>
+      <w:r>
+        <w:rPr>
+          <w:rFonts w:ascii="Arial" w:hAnsi="Arial"/>
+          <w:b w:val="0"/>
+          <w:i w:val="0"/>
+          <w:sz w:val="22"/>
+        </w:rPr>
+        <w:t>Imagens embutidas com legenda.</w:t>
+      </w:r>
+    </w:p>
+    <w:p>
+      <w:pPr>
+        <w:pStyle w:val="ListBullet"/>
+        <w:spacing w:before="20" w:after="20"/>
+      </w:pPr>
+      <w:r>
+        <w:rPr>
+          <w:rFonts w:ascii="Arial" w:hAnsi="Arial"/>
+          <w:b w:val="0"/>
+          <w:i w:val="0"/>
+          <w:sz w:val="22"/>
+        </w:rPr>
+        <w:t>Tabelas com cabeçalho e linhas alternadas.</w:t>
+      </w:r>
+    </w:p>
+    <w:p>
+      <w:pPr>
+        <w:pStyle w:val="ListBullet"/>
+        <w:spacing w:before="20" w:after="20"/>
+      </w:pPr>
+      <w:r>
+        <w:rPr>
+          <w:rFonts w:ascii="Arial" w:hAnsi="Arial"/>
+          <w:b w:val="0"/>
+          <w:i w:val="0"/>
+          <w:sz w:val="22"/>
+        </w:rPr>
+        <w:t>Blocos de destaque (NOTA, ATENÇÃO, AVISO).</w:t>
+      </w:r>
+    </w:p>
+    <w:p>
+      <w:pPr>
+        <w:pStyle w:val="ListBullet"/>
+        <w:spacing w:before="20" w:after="20"/>
+      </w:pPr>
+      <w:r>
+        <w:rPr>
+          <w:rFonts w:ascii="Arial" w:hAnsi="Arial"/>
+          <w:b w:val="0"/>
+          <w:i w:val="0"/>
+          <w:sz w:val="22"/>
+        </w:rPr>
+        <w:t>Siglas e definições com glossário automático.</w:t>
+      </w:r>
+    </w:p>
+    <w:p>
+      <w:pPr>
+        <w:spacing w:before="160" w:after="60"/>
+      </w:pPr>
+      <w:r>
+        <w:rPr>
+          <w:rFonts w:ascii="Arial" w:hAnsi="Arial"/>
+          <w:b/>
+          <w:i w:val="0"/>
+          <w:sz w:val="22"/>
+        </w:rPr>
+        <w:t>20.2 Lista de Documentos</w:t>
+      </w:r>
+    </w:p>
+    <w:p>
+      <w:pPr>
+        <w:spacing w:before="40" w:after="40"/>
+        <w:jc w:val="both"/>
+      </w:pPr>
+      <w:r>
+        <w:rPr>
+          <w:rFonts w:ascii="Arial" w:hAnsi="Arial"/>
+          <w:b w:val="0"/>
+          <w:i w:val="0"/>
+          <w:sz w:val="22"/>
+        </w:rPr>
+        <w:t>A tela /procedimentos/instrucoes lista todos os documentos cadastrados com número, título, revisão e data. Documentos podem ser editados, revisados (incremento automático do número de revisão) ou excluídos.</w:t>
+      </w:r>
+    </w:p>
+    <w:p>
+      <w:pPr>
+        <w:spacing w:before="40" w:after="40"/>
+        <w:jc w:val="both"/>
+      </w:pPr>
+      <w:r>
+        <w:rPr>
+          <w:rFonts w:ascii="Arial" w:hAnsi="Arial"/>
+          <w:b w:val="0"/>
+          <w:i/>
+          <w:color w:val="AA0000"/>
+          <w:sz w:val="22"/>
+        </w:rPr>
+        <w:t>[Imagem não encontrada: lab_procedimentos.png]</w:t>
+      </w:r>
+    </w:p>
+    <w:p>
+      <w:r>
+        <w:br w:type="page"/>
+      </w:r>
+    </w:p>
+    <w:tbl>
+      <w:tblPr>
+        <w:tblW w:type="auto" w:w="0"/>
+        <w:jc w:val="left"/>
+        <w:tblLook w:firstColumn="1" w:firstRow="1" w:lastColumn="0" w:lastRow="0" w:noHBand="0" w:noVBand="1" w:val="04A0"/>
+      </w:tblPr>
+      <w:tblGrid>
+        <w:gridCol w:w="9922"/>
+      </w:tblGrid>
+      <w:tr>
+        <w:tc>
+          <w:tcPr>
+            <w:tcW w:type="dxa" w:w="9922"/>
+            <w:shd w:val="clear" w:color="auto" w:fill="1F3864"/>
+          </w:tcPr>
+          <w:p>
+            <w:pPr>
+              <w:spacing w:before="40" w:after="40"/>
+              <w:ind w:left="170"/>
+            </w:pPr>
+            <w:r>
+              <w:rPr>
+                <w:rFonts w:ascii="Arial" w:hAnsi="Arial"/>
+                <w:b/>
+                <w:color w:val="FFFFFF"/>
+                <w:sz w:val="23"/>
+              </w:rPr>
+              <w:t>21. Navegação — Sidebar do Módulo Lab</w:t>
+            </w:r>
+          </w:p>
+        </w:tc>
+      </w:tr>
+    </w:tbl>
+    <w:p>
+      <w:pPr>
+        <w:spacing w:before="40" w:after="40"/>
+        <w:jc w:val="both"/>
+      </w:pPr>
+      <w:r>
+        <w:rPr>
+          <w:rFonts w:ascii="Arial" w:hAnsi="Arial"/>
+          <w:b w:val="0"/>
+          <w:i w:val="0"/>
+          <w:sz w:val="22"/>
+        </w:rPr>
+        <w:t>A barra lateral (sidebar) do Módulo Lab provê acesso rápido a todos os recursos. É exibida em todas as telas do módulo e organizada em seções:</w:t>
+      </w:r>
+    </w:p>
+    <w:tbl>
+      <w:tblPr>
+        <w:tblStyle w:val="TableGrid"/>
+        <w:tblW w:type="auto" w:w="0"/>
+        <w:jc w:val="left"/>
+        <w:tblLook w:firstColumn="1" w:firstRow="1" w:lastColumn="0" w:lastRow="0" w:noHBand="0" w:noVBand="1" w:val="04A0"/>
+      </w:tblPr>
+      <w:tblGrid>
+        <w:gridCol w:w="4961"/>
+        <w:gridCol w:w="4961"/>
+      </w:tblGrid>
+      <w:tr>
+        <w:tc>
+          <w:tcPr>
+            <w:tcW w:type="dxa" w:w="4961"/>
+            <w:shd w:val="clear" w:color="auto" w:fill="1F3864"/>
+          </w:tcPr>
+          <w:p>
+            <w:pPr>
+              <w:ind w:left="113"/>
+            </w:pPr>
+            <w:r>
+              <w:rPr>
+                <w:rFonts w:ascii="Arial" w:hAnsi="Arial"/>
+                <w:b/>
+                <w:i w:val="0"/>
+                <w:color w:val="FFFFFF"/>
+                <w:sz w:val="19"/>
+              </w:rPr>
+              <w:t>Seção</w:t>
+            </w:r>
+          </w:p>
+        </w:tc>
+        <w:tc>
+          <w:tcPr>
+            <w:tcW w:type="dxa" w:w="4961"/>
+            <w:shd w:val="clear" w:color="auto" w:fill="1F3864"/>
+          </w:tcPr>
+          <w:p>
+            <w:pPr>
+              <w:ind w:left="113"/>
+            </w:pPr>
+            <w:r>
+              <w:rPr>
+                <w:rFonts w:ascii="Arial" w:hAnsi="Arial"/>
+                <w:b/>
+                <w:i w:val="0"/>
+                <w:color w:val="FFFFFF"/>
+                <w:sz w:val="19"/>
+              </w:rPr>
+              <w:t>Descrição</w:t>
+            </w:r>
+          </w:p>
+        </w:tc>
+      </w:tr>
+      <w:tr>
+        <w:tc>
+          <w:tcPr>
+            <w:tcW w:type="dxa" w:w="4961"/>
+            <w:shd w:val="clear" w:color="auto" w:fill="FFFFFF"/>
+          </w:tcPr>
+          <w:p>
+            <w:pPr>
+              <w:ind w:left="113"/>
+            </w:pPr>
+            <w:r>
+              <w:rPr>
+                <w:rFonts w:ascii="Arial" w:hAnsi="Arial"/>
+                <w:b/>
+                <w:i w:val="0"/>
+                <w:sz w:val="18"/>
+              </w:rPr>
+              <w:t>Dashboard</w:t>
+            </w:r>
+          </w:p>
+        </w:tc>
+        <w:tc>
+          <w:tcPr>
+            <w:tcW w:type="dxa" w:w="4961"/>
+            <w:shd w:val="clear" w:color="auto" w:fill="FFFFFF"/>
+          </w:tcPr>
+          <w:p>
+            <w:pPr>
+              <w:ind w:left="113"/>
+            </w:pPr>
+            <w:r>
+              <w:rPr>
+                <w:rFonts w:ascii="Arial" w:hAnsi="Arial"/>
+                <w:b w:val="0"/>
+                <w:i w:val="0"/>
+                <w:sz w:val="18"/>
+              </w:rPr>
+              <w:t>/dashboard — visão consolidada com indicadores e próximas checagens</w:t>
+            </w:r>
+          </w:p>
+        </w:tc>
+      </w:tr>
+      <w:tr>
+        <w:tc>
+          <w:tcPr>
+            <w:tcW w:type="dxa" w:w="4961"/>
+            <w:shd w:val="clear" w:color="auto" w:fill="F2F2F2"/>
+          </w:tcPr>
+          <w:p>
+            <w:pPr>
+              <w:ind w:left="113"/>
+            </w:pPr>
+            <w:r>
+              <w:rPr>
+                <w:rFonts w:ascii="Arial" w:hAnsi="Arial"/>
+                <w:b/>
+                <w:i w:val="0"/>
+                <w:sz w:val="18"/>
+              </w:rPr>
+              <w:t>Equipamentos</w:t>
+            </w:r>
+          </w:p>
+        </w:tc>
+        <w:tc>
+          <w:tcPr>
+            <w:tcW w:type="dxa" w:w="4961"/>
+            <w:shd w:val="clear" w:color="auto" w:fill="F2F2F2"/>
+          </w:tcPr>
+          <w:p>
+            <w:pPr>
+              <w:ind w:left="113"/>
+            </w:pPr>
+            <w:r>
+              <w:rPr>
+                <w:rFonts w:ascii="Arial" w:hAnsi="Arial"/>
+                <w:b w:val="0"/>
+                <w:i w:val="0"/>
+                <w:sz w:val="18"/>
+              </w:rPr>
+              <w:t>/equipamentos — lista e cadastro de instrumentos por grupo</w:t>
+            </w:r>
+          </w:p>
+        </w:tc>
+      </w:tr>
+      <w:tr>
+        <w:tc>
+          <w:tcPr>
+            <w:tcW w:type="dxa" w:w="4961"/>
+            <w:shd w:val="clear" w:color="auto" w:fill="FFFFFF"/>
+          </w:tcPr>
+          <w:p>
+            <w:pPr>
+              <w:ind w:left="113"/>
+            </w:pPr>
+            <w:r>
+              <w:rPr>
+                <w:rFonts w:ascii="Arial" w:hAnsi="Arial"/>
+                <w:b/>
+                <w:i w:val="0"/>
+                <w:sz w:val="18"/>
+              </w:rPr>
+              <w:t>Certificados</w:t>
+            </w:r>
+          </w:p>
+        </w:tc>
+        <w:tc>
+          <w:tcPr>
+            <w:tcW w:type="dxa" w:w="4961"/>
+            <w:shd w:val="clear" w:color="auto" w:fill="FFFFFF"/>
+          </w:tcPr>
+          <w:p>
+            <w:pPr>
+              <w:ind w:left="113"/>
+            </w:pPr>
+            <w:r>
+              <w:rPr>
+                <w:rFonts w:ascii="Arial" w:hAnsi="Arial"/>
+                <w:b w:val="0"/>
+                <w:i w:val="0"/>
+                <w:sz w:val="18"/>
+              </w:rPr>
+              <w:t>/certificados — certificados de calibração com grade 2D</w:t>
+            </w:r>
+          </w:p>
+        </w:tc>
+      </w:tr>
+      <w:tr>
+        <w:tc>
+          <w:tcPr>
+            <w:tcW w:type="dxa" w:w="4961"/>
+            <w:shd w:val="clear" w:color="auto" w:fill="F2F2F2"/>
+          </w:tcPr>
+          <w:p>
+            <w:pPr>
+              <w:ind w:left="113"/>
+            </w:pPr>
+            <w:r>
+              <w:rPr>
+                <w:rFonts w:ascii="Arial" w:hAnsi="Arial"/>
+                <w:b/>
+                <w:i w:val="0"/>
+                <w:sz w:val="18"/>
+              </w:rPr>
+              <w:t>Checagens</w:t>
+            </w:r>
+          </w:p>
+        </w:tc>
+        <w:tc>
+          <w:tcPr>
+            <w:tcW w:type="dxa" w:w="4961"/>
+            <w:shd w:val="clear" w:color="auto" w:fill="F2F2F2"/>
+          </w:tcPr>
+          <w:p>
+            <w:pPr>
+              <w:ind w:left="113"/>
+            </w:pPr>
+            <w:r>
+              <w:rPr>
+                <w:rFonts w:ascii="Arial" w:hAnsi="Arial"/>
+                <w:b w:val="0"/>
+                <w:i w:val="0"/>
+                <w:sz w:val="18"/>
+              </w:rPr>
+              <w:t>/checagens — registro e controle de checagens intermediárias</w:t>
+            </w:r>
+          </w:p>
+        </w:tc>
+      </w:tr>
+      <w:tr>
+        <w:tc>
+          <w:tcPr>
+            <w:tcW w:type="dxa" w:w="4961"/>
+            <w:shd w:val="clear" w:color="auto" w:fill="FFFFFF"/>
+          </w:tcPr>
+          <w:p>
+            <w:pPr>
+              <w:ind w:left="113"/>
+            </w:pPr>
+            <w:r>
+              <w:rPr>
+                <w:rFonts w:ascii="Arial" w:hAnsi="Arial"/>
+                <w:b/>
+                <w:i w:val="0"/>
+                <w:sz w:val="18"/>
+              </w:rPr>
+              <w:t>Normas</w:t>
+            </w:r>
+          </w:p>
+        </w:tc>
+        <w:tc>
+          <w:tcPr>
+            <w:tcW w:type="dxa" w:w="4961"/>
+            <w:shd w:val="clear" w:color="auto" w:fill="FFFFFF"/>
+          </w:tcPr>
+          <w:p>
+            <w:pPr>
+              <w:ind w:left="113"/>
+            </w:pPr>
+            <w:r>
+              <w:rPr>
+                <w:rFonts w:ascii="Arial" w:hAnsi="Arial"/>
+                <w:b w:val="0"/>
+                <w:i w:val="0"/>
+                <w:sz w:val="18"/>
+              </w:rPr>
+              <w:t>/normas — banco de normas técnicas do laboratório</w:t>
+            </w:r>
+          </w:p>
+        </w:tc>
+      </w:tr>
+      <w:tr>
+        <w:tc>
+          <w:tcPr>
+            <w:tcW w:type="dxa" w:w="4961"/>
+            <w:shd w:val="clear" w:color="auto" w:fill="F2F2F2"/>
+          </w:tcPr>
+          <w:p>
+            <w:pPr>
+              <w:ind w:left="113"/>
+            </w:pPr>
+            <w:r>
+              <w:rPr>
+                <w:rFonts w:ascii="Arial" w:hAnsi="Arial"/>
+                <w:b/>
+                <w:i w:val="0"/>
+                <w:sz w:val="18"/>
+              </w:rPr>
+              <w:t>Procedimentos</w:t>
+            </w:r>
+          </w:p>
+        </w:tc>
+        <w:tc>
+          <w:tcPr>
+            <w:tcW w:type="dxa" w:w="4961"/>
+            <w:shd w:val="clear" w:color="auto" w:fill="F2F2F2"/>
+          </w:tcPr>
+          <w:p>
+            <w:pPr>
+              <w:ind w:left="113"/>
+            </w:pPr>
+            <w:r>
+              <w:rPr>
+                <w:rFonts w:ascii="Arial" w:hAnsi="Arial"/>
+                <w:b w:val="0"/>
+                <w:i w:val="0"/>
+                <w:sz w:val="18"/>
+              </w:rPr>
+              <w:t>/procedimentos — hub de checagens e editor de IT/PC</w:t>
+            </w:r>
+          </w:p>
+        </w:tc>
+      </w:tr>
+      <w:tr>
+        <w:tc>
+          <w:tcPr>
+            <w:tcW w:type="dxa" w:w="4961"/>
+            <w:shd w:val="clear" w:color="auto" w:fill="FFFFFF"/>
+          </w:tcPr>
+          <w:p>
+            <w:pPr>
+              <w:ind w:left="113"/>
+            </w:pPr>
+            <w:r>
+              <w:rPr>
+                <w:rFonts w:ascii="Arial" w:hAnsi="Arial"/>
+                <w:b/>
+                <w:i w:val="0"/>
+                <w:sz w:val="18"/>
+              </w:rPr>
+              <w:t>Instruções de Trabalho</w:t>
+            </w:r>
+          </w:p>
+        </w:tc>
+        <w:tc>
+          <w:tcPr>
+            <w:tcW w:type="dxa" w:w="4961"/>
+            <w:shd w:val="clear" w:color="auto" w:fill="FFFFFF"/>
+          </w:tcPr>
+          <w:p>
+            <w:pPr>
+              <w:ind w:left="113"/>
+            </w:pPr>
+            <w:r>
+              <w:rPr>
+                <w:rFonts w:ascii="Arial" w:hAnsi="Arial"/>
+                <w:b w:val="0"/>
+                <w:i w:val="0"/>
+                <w:sz w:val="18"/>
+              </w:rPr>
+              <w:t>/procedimentos/instrucoes — lista de documentos IT/PC</w:t>
+            </w:r>
+          </w:p>
+        </w:tc>
+      </w:tr>
+      <w:tr>
+        <w:tc>
+          <w:tcPr>
+            <w:tcW w:type="dxa" w:w="4961"/>
+            <w:shd w:val="clear" w:color="auto" w:fill="F2F2F2"/>
+          </w:tcPr>
+          <w:p>
+            <w:pPr>
+              <w:ind w:left="113"/>
+            </w:pPr>
+            <w:r>
+              <w:rPr>
+                <w:rFonts w:ascii="Arial" w:hAnsi="Arial"/>
+                <w:b/>
+                <w:i w:val="0"/>
+                <w:sz w:val="18"/>
+              </w:rPr>
+              <w:t>Relatórios CISPR 15</w:t>
+            </w:r>
+          </w:p>
+        </w:tc>
+        <w:tc>
+          <w:tcPr>
+            <w:tcW w:type="dxa" w:w="4961"/>
+            <w:shd w:val="clear" w:color="auto" w:fill="F2F2F2"/>
+          </w:tcPr>
+          <w:p>
+            <w:pPr>
+              <w:ind w:left="113"/>
+            </w:pPr>
+            <w:r>
+              <w:rPr>
+                <w:rFonts w:ascii="Arial" w:hAnsi="Arial"/>
+                <w:b w:val="0"/>
+                <w:i w:val="0"/>
+                <w:sz w:val="18"/>
+              </w:rPr>
+              <w:t>/cispr15 — retorna ao formulário principal de emissão</w:t>
+            </w:r>
+          </w:p>
+        </w:tc>
+      </w:tr>
+    </w:tbl>
+    <w:p/>
+    <w:p>
+      <w:r>
+        <w:br w:type="page"/>
+      </w:r>
+    </w:p>
+    <w:p>
+      <w:r>
+        <w:br w:type="page"/>
+      </w:r>
+    </w:p>
+    <w:tbl>
+      <w:tblPr>
+        <w:tblW w:type="auto" w:w="0"/>
+        <w:jc w:val="left"/>
+        <w:tblLook w:firstColumn="1" w:firstRow="1" w:lastColumn="0" w:lastRow="0" w:noHBand="0" w:noVBand="1" w:val="04A0"/>
+      </w:tblPr>
+      <w:tblGrid>
+        <w:gridCol w:w="9922"/>
+      </w:tblGrid>
+      <w:tr>
+        <w:tc>
+          <w:tcPr>
+            <w:tcW w:type="dxa" w:w="9922"/>
+            <w:shd w:val="clear" w:color="auto" w:fill="1F3864"/>
+          </w:tcPr>
+          <w:p>
+            <w:pPr>
+              <w:spacing w:before="40" w:after="40"/>
+              <w:ind w:left="170"/>
+            </w:pPr>
+            <w:r>
+              <w:rPr>
+                <w:rFonts w:ascii="Arial" w:hAnsi="Arial"/>
+                <w:b/>
+                <w:color w:val="FFFFFF"/>
+                <w:sz w:val="23"/>
+              </w:rPr>
+              <w:t>22. Declaração de Validação e Assinaturas</w:t>
             </w:r>
           </w:p>
         </w:tc>
@@ -6336,7 +7985,7 @@
           <w:i w:val="0"/>
           <w:sz w:val="22"/>
         </w:rPr>
-        <w:t>Porto Alegre, 20/05/2026.</w:t>
+        <w:t>Porto Alegre, 05/06/2026.</w:t>
       </w:r>
     </w:p>
     <w:tbl>

</xml_diff>